<commit_message>
Update lab website domain
</commit_message>
<xml_diff>
--- a/assembly/reference/assembly-guide-2018-06-22.docx
+++ b/assembly/reference/assembly-guide-2018-06-22.docx
@@ -1826,7 +1826,7 @@
       </w:tabs>
     </w:pPr>
     <w:r>
-      <w:t>wvurail.org/dspira</w:t>
+      <w:t>rail.wvu.edu/dspira</w:t>
     </w:r>
     <w:r>
       <w:tab/>
@@ -1889,7 +1889,7 @@
       </w:tabs>
     </w:pPr>
     <w:r>
-      <w:t>wvurail.org/dspira</w:t>
+      <w:t>rail.wvu.edu/dspira</w:t>
     </w:r>
     <w:r>
       <w:tab/>
@@ -1942,7 +1942,7 @@
       </w:tabs>
     </w:pPr>
     <w:r>
-      <w:t>wvurail.org/dspira</w:t>
+      <w:t>rail.wvu.edu/dspira</w:t>
     </w:r>
     <w:r>
       <w:tab/>

</xml_diff>